<commit_message>
docs(2.1.4): the re-wet-at-clear race is fixed (b245d94), not a known limit
9ae1295 documented the race as a known limit; b245d94 fixes it in firmware.
CHANGELOG gains a Safety bullet and loses the Known-limitations entry; the R9
catalogue text and both app-team notes say a re-wet at the clear re-locks the valve.

Co-Authored-By: Claude Opus 5.5 <noreply@anthropic.com>
</commit_message>
<xml_diff>
--- a/docs/telemetry/eFloStop2_Telemetry_Messages_v5.0.docx
+++ b/docs/telemetry/eFloStop2_Telemetry_Messages_v5.0.docx
@@ -117,7 +117,7 @@
               <w:rPr>
                 <w:sz w:val="18"/>
               </w:rPr>
-              <w:t>a5a07eab6d0ef82481e2b9453cb9f951a7ff221f</w:t>
+              <w:t>b245d943bd59c177157348b9f18829ab23aac07d</w:t>
             </w:r>
           </w:p>
         </w:tc>
@@ -20497,7 +20497,7 @@
           <w:i w:val="0"/>
           <w:sz w:val="21"/>
         </w:rPr>
-        <w:t>Every source dry for 10 seconds, so the hub released the latch itself. Does NOT re-open the valve; valve_open or the valve button does. Same identity rule as R8. Since 2.1.4 the dwell is 10 s (it was 30 s), and the hub polls every 2 s while the clear is pending, so this arrives about 10-12 s after the last source reports dry (it was 30-60 s). A sensor that goes wet again 10-30 s after drying (up to about 60 s, counting the old idle wait) therefore now gets a full clear and re-latch cycle (this event, then auto_close again); the valve stays closed throughout. Known limit: a re-wet that lands within about 2 s of the clear (before the next rules tick, or before the valve's read-back of the clear) can instead be taken for a valve-button override: no second auto_close, then water_access_override_enabled with trigger "button" and a 24 h window, so auto-close is blocked and valve_open is accepted while the sensor is still wet. The race predates 2.1.4, when its window was up to 30 s wide.</w:t>
+        <w:t>Every source dry for 10 seconds, so the hub released the latch itself. Does NOT re-open the valve; valve_open or the valve button does. Same identity rule as R8. Since 2.1.4 the dwell is 10 s (it was 30 s), and the hub polls every 2 s while the clear is pending, so this arrives about 10-12 s after the last source reports dry (it was 30-60 s). A sensor that goes wet again 10-30 s after drying (up to about 60 s, counting the old idle wait) therefore now gets a full clear and re-latch cycle (this event, then auto_close again); the valve stays closed throughout. That includes a re-wet at the very moment of the clear: a newly latched incident always re-asserts RMLEAK and closes, so it can no longer be misread as a valve-button override (before 2.1.4 it could start a false 24 h window).</w:t>
       </w:r>
     </w:p>
     <w:p>

</xml_diff>